<commit_message>
Updated roll number in project report
</commit_message>
<xml_diff>
--- a/Student Academic Perfomance Project Report.docx
+++ b/Student Academic Perfomance Project Report.docx
@@ -380,8 +380,10 @@
           <w:szCs w:val="44"/>
           <w:lang w:val="en-US"/>
         </w:rPr>
-        <w:t>Roll No : 58</w:t>
-      </w:r>
+        <w:t>Roll No : 59</w:t>
+      </w:r>
+      <w:bookmarkStart w:id="0" w:name="_GoBack"/>
+      <w:bookmarkEnd w:id="0"/>
       <w:r>
         <w:rPr>
           <w:rFonts w:ascii="Times New Roman" w:hAnsi="Times New Roman" w:cs="Times New Roman"/>
@@ -1270,10 +1272,7 @@
         <w:pStyle w:val="Heading2"/>
       </w:pPr>
       <w:r>
-        <w:t>5</w:t>
-      </w:r>
-      <w:r>
-        <w:t>. Project Workflow</w:t>
+        <w:t>5. Project Workflow</w:t>
       </w:r>
     </w:p>
     <w:p>
@@ -2684,7 +2683,6 @@
       <w:pPr>
         <w:pStyle w:val="w6asjqtextbase"/>
       </w:pPr>
-      <w:bookmarkStart w:id="0" w:name="_GoBack"/>
       <w:r>
         <w:rPr>
           <w:noProof/>
@@ -2732,7 +2730,6 @@
           </wp:inline>
         </w:drawing>
       </w:r>
-      <w:bookmarkEnd w:id="0"/>
     </w:p>
     <w:p>
       <w:pPr>

</xml_diff>